<commit_message>
Figma desktop complete, images, logos
</commit_message>
<xml_diff>
--- a/docs/kravspecifikation_och_planering.docx
+++ b/docs/kravspecifikation_och_planering.docx
@@ -96,7 +96,27 @@
           <w:lang w:eastAsia="sv-SE"/>
           <w14:ligatures w14:val="none"/>
         </w:rPr>
-        <w:t xml:space="preserve">Tydlig branding med </w:t>
+        <w:t xml:space="preserve">Tydlig </w:t>
+      </w:r>
+      <w:proofErr w:type="spellStart"/>
+      <w:r>
+        <w:rPr>
+          <w:rFonts w:ascii="Times New Roman" w:eastAsia="Times New Roman" w:hAnsi="Times New Roman" w:cs="Times New Roman"/>
+          <w:kern w:val="36"/>
+          <w:lang w:eastAsia="sv-SE"/>
+          <w14:ligatures w14:val="none"/>
+        </w:rPr>
+        <w:t>branding</w:t>
+      </w:r>
+      <w:proofErr w:type="spellEnd"/>
+      <w:r>
+        <w:rPr>
+          <w:rFonts w:ascii="Times New Roman" w:eastAsia="Times New Roman" w:hAnsi="Times New Roman" w:cs="Times New Roman"/>
+          <w:kern w:val="36"/>
+          <w:lang w:eastAsia="sv-SE"/>
+          <w14:ligatures w14:val="none"/>
+        </w:rPr>
+        <w:t xml:space="preserve"> med </w:t>
       </w:r>
       <w:r>
         <w:rPr>
@@ -149,7 +169,27 @@
           <w:lang w:eastAsia="sv-SE"/>
           <w14:ligatures w14:val="none"/>
         </w:rPr>
-        <w:t>Färgpalett: vitt (ca 50%), svart (ca 20%), grått (ca 20%, två nyanser ev), accent rött/orange (ca 10%).</w:t>
+        <w:t xml:space="preserve">Färgpalett: vitt (ca 50%), svart (ca 20%), grått (ca 20%, två nyanser </w:t>
+      </w:r>
+      <w:proofErr w:type="spellStart"/>
+      <w:r>
+        <w:rPr>
+          <w:rFonts w:ascii="Times New Roman" w:eastAsia="Times New Roman" w:hAnsi="Times New Roman" w:cs="Times New Roman"/>
+          <w:kern w:val="36"/>
+          <w:lang w:eastAsia="sv-SE"/>
+          <w14:ligatures w14:val="none"/>
+        </w:rPr>
+        <w:t>ev</w:t>
+      </w:r>
+      <w:proofErr w:type="spellEnd"/>
+      <w:r>
+        <w:rPr>
+          <w:rFonts w:ascii="Times New Roman" w:eastAsia="Times New Roman" w:hAnsi="Times New Roman" w:cs="Times New Roman"/>
+          <w:kern w:val="36"/>
+          <w:lang w:eastAsia="sv-SE"/>
+          <w14:ligatures w14:val="none"/>
+        </w:rPr>
+        <w:t>), accent rött/orange (ca 10%).</w:t>
       </w:r>
     </w:p>
     <w:p>
@@ -201,7 +241,47 @@
           <w:lang w:eastAsia="sv-SE"/>
           <w14:ligatures w14:val="none"/>
         </w:rPr>
-        <w:t>Axplock av utbud i en preview under hero med nya produkter, rabatterade, bästsäljare.</w:t>
+        <w:t xml:space="preserve">Axplock av utbud i en </w:t>
+      </w:r>
+      <w:proofErr w:type="spellStart"/>
+      <w:r>
+        <w:rPr>
+          <w:rFonts w:ascii="Times New Roman" w:eastAsia="Times New Roman" w:hAnsi="Times New Roman" w:cs="Times New Roman"/>
+          <w:kern w:val="36"/>
+          <w:lang w:eastAsia="sv-SE"/>
+          <w14:ligatures w14:val="none"/>
+        </w:rPr>
+        <w:t>preview</w:t>
+      </w:r>
+      <w:proofErr w:type="spellEnd"/>
+      <w:r>
+        <w:rPr>
+          <w:rFonts w:ascii="Times New Roman" w:eastAsia="Times New Roman" w:hAnsi="Times New Roman" w:cs="Times New Roman"/>
+          <w:kern w:val="36"/>
+          <w:lang w:eastAsia="sv-SE"/>
+          <w14:ligatures w14:val="none"/>
+        </w:rPr>
+        <w:t xml:space="preserve"> under </w:t>
+      </w:r>
+      <w:proofErr w:type="spellStart"/>
+      <w:r>
+        <w:rPr>
+          <w:rFonts w:ascii="Times New Roman" w:eastAsia="Times New Roman" w:hAnsi="Times New Roman" w:cs="Times New Roman"/>
+          <w:kern w:val="36"/>
+          <w:lang w:eastAsia="sv-SE"/>
+          <w14:ligatures w14:val="none"/>
+        </w:rPr>
+        <w:t>hero</w:t>
+      </w:r>
+      <w:proofErr w:type="spellEnd"/>
+      <w:r>
+        <w:rPr>
+          <w:rFonts w:ascii="Times New Roman" w:eastAsia="Times New Roman" w:hAnsi="Times New Roman" w:cs="Times New Roman"/>
+          <w:kern w:val="36"/>
+          <w:lang w:eastAsia="sv-SE"/>
+          <w14:ligatures w14:val="none"/>
+        </w:rPr>
+        <w:t xml:space="preserve"> med nya produkter, rabatterade, bästsäljare.</w:t>
       </w:r>
     </w:p>
     <w:p>
@@ -300,20 +380,19 @@
           <w:lang w:val="en-US" w:eastAsia="sv-SE"/>
           <w14:ligatures w14:val="none"/>
         </w:rPr>
-        <w:t>&lt;link rel="preconnect" href="https://fonts.googleapis.com"&gt; &lt;link rel="preconnect" href="https://fonts.gstatic.com" crossorigin&gt; &lt;link href="https://fonts.googleapis.com/css2?family=Cinzel:wght@400..900&amp;family=Fondamento:ital@0;1&amp;family=Oswald:wght@200..700&amp;family=Sekuya&amp;display=swap" rel="stylesheet"&gt;</w:t>
-      </w:r>
-    </w:p>
-    <w:p>
-      <w:pPr>
-        <w:spacing w:before="100" w:beforeAutospacing="1" w:after="100" w:afterAutospacing="1" w:line="240" w:lineRule="auto"/>
-        <w:outlineLvl w:val="0"/>
+        <w:t xml:space="preserve">&lt;link </w:t>
+      </w:r>
+      <w:proofErr w:type="spellStart"/>
+      <w:r>
         <w:rPr>
           <w:rFonts w:ascii="Times New Roman" w:eastAsia="Times New Roman" w:hAnsi="Times New Roman" w:cs="Times New Roman"/>
           <w:kern w:val="36"/>
           <w:lang w:val="en-US" w:eastAsia="sv-SE"/>
           <w14:ligatures w14:val="none"/>
         </w:rPr>
-      </w:pPr>
+        <w:t>rel</w:t>
+      </w:r>
+      <w:proofErr w:type="spellEnd"/>
       <w:r>
         <w:rPr>
           <w:rFonts w:ascii="Times New Roman" w:eastAsia="Times New Roman" w:hAnsi="Times New Roman" w:cs="Times New Roman"/>
@@ -321,20 +400,19 @@
           <w:lang w:val="en-US" w:eastAsia="sv-SE"/>
           <w14:ligatures w14:val="none"/>
         </w:rPr>
-        <w:t>.sekuya-regular {</w:t>
-      </w:r>
-    </w:p>
-    <w:p>
-      <w:pPr>
-        <w:spacing w:before="100" w:beforeAutospacing="1" w:after="100" w:afterAutospacing="1" w:line="240" w:lineRule="auto"/>
-        <w:outlineLvl w:val="0"/>
+        <w:t>="</w:t>
+      </w:r>
+      <w:proofErr w:type="spellStart"/>
+      <w:r>
         <w:rPr>
           <w:rFonts w:ascii="Times New Roman" w:eastAsia="Times New Roman" w:hAnsi="Times New Roman" w:cs="Times New Roman"/>
           <w:kern w:val="36"/>
           <w:lang w:val="en-US" w:eastAsia="sv-SE"/>
           <w14:ligatures w14:val="none"/>
         </w:rPr>
-      </w:pPr>
+        <w:t>preconnect</w:t>
+      </w:r>
+      <w:proofErr w:type="spellEnd"/>
       <w:r>
         <w:rPr>
           <w:rFonts w:ascii="Times New Roman" w:eastAsia="Times New Roman" w:hAnsi="Times New Roman" w:cs="Times New Roman"/>
@@ -342,20 +420,19 @@
           <w:lang w:val="en-US" w:eastAsia="sv-SE"/>
           <w14:ligatures w14:val="none"/>
         </w:rPr>
-        <w:t xml:space="preserve">  font-family: "Sekuya", system-ui;</w:t>
-      </w:r>
-    </w:p>
-    <w:p>
-      <w:pPr>
-        <w:spacing w:before="100" w:beforeAutospacing="1" w:after="100" w:afterAutospacing="1" w:line="240" w:lineRule="auto"/>
-        <w:outlineLvl w:val="0"/>
+        <w:t xml:space="preserve">" </w:t>
+      </w:r>
+      <w:proofErr w:type="spellStart"/>
+      <w:r>
         <w:rPr>
           <w:rFonts w:ascii="Times New Roman" w:eastAsia="Times New Roman" w:hAnsi="Times New Roman" w:cs="Times New Roman"/>
           <w:kern w:val="36"/>
           <w:lang w:val="en-US" w:eastAsia="sv-SE"/>
           <w14:ligatures w14:val="none"/>
         </w:rPr>
-      </w:pPr>
+        <w:t>href</w:t>
+      </w:r>
+      <w:proofErr w:type="spellEnd"/>
       <w:r>
         <w:rPr>
           <w:rFonts w:ascii="Times New Roman" w:eastAsia="Times New Roman" w:hAnsi="Times New Roman" w:cs="Times New Roman"/>
@@ -363,20 +440,19 @@
           <w:lang w:val="en-US" w:eastAsia="sv-SE"/>
           <w14:ligatures w14:val="none"/>
         </w:rPr>
-        <w:t xml:space="preserve">  font-weight: 400;</w:t>
-      </w:r>
-    </w:p>
-    <w:p>
-      <w:pPr>
-        <w:spacing w:before="100" w:beforeAutospacing="1" w:after="100" w:afterAutospacing="1" w:line="240" w:lineRule="auto"/>
-        <w:outlineLvl w:val="0"/>
+        <w:t xml:space="preserve">="https://fonts.googleapis.com"&gt; &lt;link </w:t>
+      </w:r>
+      <w:proofErr w:type="spellStart"/>
+      <w:r>
         <w:rPr>
           <w:rFonts w:ascii="Times New Roman" w:eastAsia="Times New Roman" w:hAnsi="Times New Roman" w:cs="Times New Roman"/>
           <w:kern w:val="36"/>
           <w:lang w:val="en-US" w:eastAsia="sv-SE"/>
           <w14:ligatures w14:val="none"/>
         </w:rPr>
-      </w:pPr>
+        <w:t>rel</w:t>
+      </w:r>
+      <w:proofErr w:type="spellEnd"/>
       <w:r>
         <w:rPr>
           <w:rFonts w:ascii="Times New Roman" w:eastAsia="Times New Roman" w:hAnsi="Times New Roman" w:cs="Times New Roman"/>
@@ -384,20 +460,19 @@
           <w:lang w:val="en-US" w:eastAsia="sv-SE"/>
           <w14:ligatures w14:val="none"/>
         </w:rPr>
-        <w:t xml:space="preserve">  font-style: normal;</w:t>
-      </w:r>
-    </w:p>
-    <w:p>
-      <w:pPr>
-        <w:spacing w:before="100" w:beforeAutospacing="1" w:after="100" w:afterAutospacing="1" w:line="240" w:lineRule="auto"/>
-        <w:outlineLvl w:val="0"/>
+        <w:t>="</w:t>
+      </w:r>
+      <w:proofErr w:type="spellStart"/>
+      <w:r>
         <w:rPr>
           <w:rFonts w:ascii="Times New Roman" w:eastAsia="Times New Roman" w:hAnsi="Times New Roman" w:cs="Times New Roman"/>
           <w:kern w:val="36"/>
           <w:lang w:val="en-US" w:eastAsia="sv-SE"/>
           <w14:ligatures w14:val="none"/>
         </w:rPr>
-      </w:pPr>
+        <w:t>preconnect</w:t>
+      </w:r>
+      <w:proofErr w:type="spellEnd"/>
       <w:r>
         <w:rPr>
           <w:rFonts w:ascii="Times New Roman" w:eastAsia="Times New Roman" w:hAnsi="Times New Roman" w:cs="Times New Roman"/>
@@ -405,8 +480,9 @@
           <w:lang w:val="en-US" w:eastAsia="sv-SE"/>
           <w14:ligatures w14:val="none"/>
         </w:rPr>
-        <w:t>}</w:t>
-      </w:r>
+        <w:t xml:space="preserve">" </w:t>
+      </w:r>
+      <w:proofErr w:type="spellStart"/>
       <w:r>
         <w:rPr>
           <w:rFonts w:ascii="Times New Roman" w:eastAsia="Times New Roman" w:hAnsi="Times New Roman" w:cs="Times New Roman"/>
@@ -414,20 +490,58 @@
           <w:lang w:val="en-US" w:eastAsia="sv-SE"/>
           <w14:ligatures w14:val="none"/>
         </w:rPr>
-        <w:t xml:space="preserve"> </w:t>
-      </w:r>
-    </w:p>
-    <w:p>
-      <w:pPr>
-        <w:spacing w:before="100" w:beforeAutospacing="1" w:after="100" w:afterAutospacing="1" w:line="240" w:lineRule="auto"/>
-        <w:outlineLvl w:val="0"/>
+        <w:t>href</w:t>
+      </w:r>
+      <w:proofErr w:type="spellEnd"/>
+      <w:r>
         <w:rPr>
           <w:rFonts w:ascii="Times New Roman" w:eastAsia="Times New Roman" w:hAnsi="Times New Roman" w:cs="Times New Roman"/>
           <w:kern w:val="36"/>
           <w:lang w:val="en-US" w:eastAsia="sv-SE"/>
           <w14:ligatures w14:val="none"/>
         </w:rPr>
-      </w:pPr>
+        <w:t xml:space="preserve">="https://fonts.gstatic.com" </w:t>
+      </w:r>
+      <w:proofErr w:type="spellStart"/>
+      <w:r>
+        <w:rPr>
+          <w:rFonts w:ascii="Times New Roman" w:eastAsia="Times New Roman" w:hAnsi="Times New Roman" w:cs="Times New Roman"/>
+          <w:kern w:val="36"/>
+          <w:lang w:val="en-US" w:eastAsia="sv-SE"/>
+          <w14:ligatures w14:val="none"/>
+        </w:rPr>
+        <w:t>crossorigin</w:t>
+      </w:r>
+      <w:proofErr w:type="spellEnd"/>
+      <w:r>
+        <w:rPr>
+          <w:rFonts w:ascii="Times New Roman" w:eastAsia="Times New Roman" w:hAnsi="Times New Roman" w:cs="Times New Roman"/>
+          <w:kern w:val="36"/>
+          <w:lang w:val="en-US" w:eastAsia="sv-SE"/>
+          <w14:ligatures w14:val="none"/>
+        </w:rPr>
+        <w:t xml:space="preserve">&gt; &lt;link href="https://fonts.googleapis.com/css2?family=Sekuya&amp;display=swap" </w:t>
+      </w:r>
+      <w:proofErr w:type="spellStart"/>
+      <w:r>
+        <w:rPr>
+          <w:rFonts w:ascii="Times New Roman" w:eastAsia="Times New Roman" w:hAnsi="Times New Roman" w:cs="Times New Roman"/>
+          <w:kern w:val="36"/>
+          <w:lang w:val="en-US" w:eastAsia="sv-SE"/>
+          <w14:ligatures w14:val="none"/>
+        </w:rPr>
+        <w:t>rel</w:t>
+      </w:r>
+      <w:proofErr w:type="spellEnd"/>
+      <w:r>
+        <w:rPr>
+          <w:rFonts w:ascii="Times New Roman" w:eastAsia="Times New Roman" w:hAnsi="Times New Roman" w:cs="Times New Roman"/>
+          <w:kern w:val="36"/>
+          <w:lang w:val="en-US" w:eastAsia="sv-SE"/>
+          <w14:ligatures w14:val="none"/>
+        </w:rPr>
+        <w:t>="stylesheet"&gt;</w:t>
+      </w:r>
     </w:p>
     <w:p>
       <w:pPr>
@@ -489,7 +603,35 @@
           <w:lang w:eastAsia="sv-SE"/>
           <w14:ligatures w14:val="none"/>
         </w:rPr>
-        <w:t>1. Funktionella krav (Frontend)</w:t>
+        <w:t>1. Funktionella krav (</w:t>
+      </w:r>
+      <w:proofErr w:type="spellStart"/>
+      <w:r>
+        <w:rPr>
+          <w:rFonts w:ascii="Times New Roman" w:eastAsia="Times New Roman" w:hAnsi="Times New Roman" w:cs="Times New Roman"/>
+          <w:b/>
+          <w:bCs/>
+          <w:kern w:val="0"/>
+          <w:sz w:val="36"/>
+          <w:szCs w:val="36"/>
+          <w:lang w:eastAsia="sv-SE"/>
+          <w14:ligatures w14:val="none"/>
+        </w:rPr>
+        <w:t>Frontend</w:t>
+      </w:r>
+      <w:proofErr w:type="spellEnd"/>
+      <w:r>
+        <w:rPr>
+          <w:rFonts w:ascii="Times New Roman" w:eastAsia="Times New Roman" w:hAnsi="Times New Roman" w:cs="Times New Roman"/>
+          <w:b/>
+          <w:bCs/>
+          <w:kern w:val="0"/>
+          <w:sz w:val="36"/>
+          <w:szCs w:val="36"/>
+          <w:lang w:eastAsia="sv-SE"/>
+          <w14:ligatures w14:val="none"/>
+        </w:rPr>
+        <w:t>)</w:t>
       </w:r>
     </w:p>
     <w:p>
@@ -566,7 +708,27 @@
           <w:lang w:eastAsia="sv-SE"/>
           <w14:ligatures w14:val="none"/>
         </w:rPr>
-        <w:t xml:space="preserve">FR2: Visa logotyp, hero image, titel, slogan </w:t>
+        <w:t xml:space="preserve">FR2: Visa logotyp, </w:t>
+      </w:r>
+      <w:proofErr w:type="spellStart"/>
+      <w:r>
+        <w:rPr>
+          <w:rFonts w:ascii="Times New Roman" w:eastAsia="Times New Roman" w:hAnsi="Times New Roman" w:cs="Times New Roman"/>
+          <w:kern w:val="0"/>
+          <w:lang w:eastAsia="sv-SE"/>
+          <w14:ligatures w14:val="none"/>
+        </w:rPr>
+        <w:t>hero</w:t>
+      </w:r>
+      <w:proofErr w:type="spellEnd"/>
+      <w:r>
+        <w:rPr>
+          <w:rFonts w:ascii="Times New Roman" w:eastAsia="Times New Roman" w:hAnsi="Times New Roman" w:cs="Times New Roman"/>
+          <w:kern w:val="0"/>
+          <w:lang w:eastAsia="sv-SE"/>
+          <w14:ligatures w14:val="none"/>
+        </w:rPr>
+        <w:t xml:space="preserve"> image, titel, slogan </w:t>
       </w:r>
     </w:p>
     <w:p>
@@ -619,7 +781,6 @@
           <w:lang w:eastAsia="sv-SE"/>
           <w14:ligatures w14:val="none"/>
         </w:rPr>
-        <w:lastRenderedPageBreak/>
         <w:t>Produktlista</w:t>
       </w:r>
     </w:p>
@@ -870,6 +1031,7 @@
           <w:lang w:eastAsia="sv-SE"/>
           <w14:ligatures w14:val="none"/>
         </w:rPr>
+        <w:lastRenderedPageBreak/>
         <w:t>Betalning</w:t>
       </w:r>
     </w:p>
@@ -918,7 +1080,27 @@
           <w:lang w:eastAsia="sv-SE"/>
           <w14:ligatures w14:val="none"/>
         </w:rPr>
-        <w:t xml:space="preserve">FR13: Välja betalningsmetod (kort / Swish – simulerat) </w:t>
+        <w:t xml:space="preserve">FR13: Välja betalningsmetod (kort / </w:t>
+      </w:r>
+      <w:proofErr w:type="spellStart"/>
+      <w:r>
+        <w:rPr>
+          <w:rFonts w:ascii="Times New Roman" w:eastAsia="Times New Roman" w:hAnsi="Times New Roman" w:cs="Times New Roman"/>
+          <w:kern w:val="0"/>
+          <w:lang w:eastAsia="sv-SE"/>
+          <w14:ligatures w14:val="none"/>
+        </w:rPr>
+        <w:t>Swish</w:t>
+      </w:r>
+      <w:proofErr w:type="spellEnd"/>
+      <w:r>
+        <w:rPr>
+          <w:rFonts w:ascii="Times New Roman" w:eastAsia="Times New Roman" w:hAnsi="Times New Roman" w:cs="Times New Roman"/>
+          <w:kern w:val="0"/>
+          <w:lang w:eastAsia="sv-SE"/>
+          <w14:ligatures w14:val="none"/>
+        </w:rPr>
+        <w:t xml:space="preserve"> – simulerat) </w:t>
       </w:r>
     </w:p>
     <w:p>
@@ -1072,7 +1254,27 @@
           <w:lang w:eastAsia="sv-SE"/>
           <w14:ligatures w14:val="none"/>
         </w:rPr>
-        <w:t xml:space="preserve">FR17: Routing mellan sidor </w:t>
+        <w:t xml:space="preserve">FR17: </w:t>
+      </w:r>
+      <w:proofErr w:type="spellStart"/>
+      <w:r>
+        <w:rPr>
+          <w:rFonts w:ascii="Times New Roman" w:eastAsia="Times New Roman" w:hAnsi="Times New Roman" w:cs="Times New Roman"/>
+          <w:kern w:val="0"/>
+          <w:lang w:eastAsia="sv-SE"/>
+          <w14:ligatures w14:val="none"/>
+        </w:rPr>
+        <w:t>Routing</w:t>
+      </w:r>
+      <w:proofErr w:type="spellEnd"/>
+      <w:r>
+        <w:rPr>
+          <w:rFonts w:ascii="Times New Roman" w:eastAsia="Times New Roman" w:hAnsi="Times New Roman" w:cs="Times New Roman"/>
+          <w:kern w:val="0"/>
+          <w:lang w:eastAsia="sv-SE"/>
+          <w14:ligatures w14:val="none"/>
+        </w:rPr>
+        <w:t xml:space="preserve"> mellan sidor </w:t>
       </w:r>
     </w:p>
     <w:p>
@@ -1354,7 +1556,27 @@
           <w:lang w:eastAsia="sv-SE"/>
           <w14:ligatures w14:val="none"/>
         </w:rPr>
-        <w:t xml:space="preserve">FR23: Skapa order vid checkout </w:t>
+        <w:t xml:space="preserve">FR23: Skapa order vid </w:t>
+      </w:r>
+      <w:proofErr w:type="spellStart"/>
+      <w:r>
+        <w:rPr>
+          <w:rFonts w:ascii="Times New Roman" w:eastAsia="Times New Roman" w:hAnsi="Times New Roman" w:cs="Times New Roman"/>
+          <w:kern w:val="0"/>
+          <w:lang w:eastAsia="sv-SE"/>
+          <w14:ligatures w14:val="none"/>
+        </w:rPr>
+        <w:t>checkout</w:t>
+      </w:r>
+      <w:proofErr w:type="spellEnd"/>
+      <w:r>
+        <w:rPr>
+          <w:rFonts w:ascii="Times New Roman" w:eastAsia="Times New Roman" w:hAnsi="Times New Roman" w:cs="Times New Roman"/>
+          <w:kern w:val="0"/>
+          <w:lang w:eastAsia="sv-SE"/>
+          <w14:ligatures w14:val="none"/>
+        </w:rPr>
+        <w:t xml:space="preserve"> </w:t>
       </w:r>
     </w:p>
     <w:p>
@@ -1378,7 +1600,27 @@
           <w:lang w:eastAsia="sv-SE"/>
           <w14:ligatures w14:val="none"/>
         </w:rPr>
-        <w:t xml:space="preserve">FR24: Skicka order till backend </w:t>
+        <w:t xml:space="preserve">FR24: Skicka order till </w:t>
+      </w:r>
+      <w:proofErr w:type="spellStart"/>
+      <w:r>
+        <w:rPr>
+          <w:rFonts w:ascii="Times New Roman" w:eastAsia="Times New Roman" w:hAnsi="Times New Roman" w:cs="Times New Roman"/>
+          <w:kern w:val="0"/>
+          <w:lang w:eastAsia="sv-SE"/>
+          <w14:ligatures w14:val="none"/>
+        </w:rPr>
+        <w:t>backend</w:t>
+      </w:r>
+      <w:proofErr w:type="spellEnd"/>
+      <w:r>
+        <w:rPr>
+          <w:rFonts w:ascii="Times New Roman" w:eastAsia="Times New Roman" w:hAnsi="Times New Roman" w:cs="Times New Roman"/>
+          <w:kern w:val="0"/>
+          <w:lang w:eastAsia="sv-SE"/>
+          <w14:ligatures w14:val="none"/>
+        </w:rPr>
+        <w:t xml:space="preserve"> </w:t>
       </w:r>
     </w:p>
     <w:p>
@@ -1398,7 +1640,6 @@
           <w:lang w:eastAsia="sv-SE"/>
           <w14:ligatures w14:val="none"/>
         </w:rPr>
-        <w:lastRenderedPageBreak/>
         <w:pict w14:anchorId="679CF2BA">
           <v:rect id="_x0000_i1027" style="width:0;height:1.5pt" o:hralign="center" o:hrstd="t" o:hr="t" fillcolor="#a0a0a0" stroked="f"/>
         </w:pict>
@@ -1430,8 +1671,23 @@
           <w:lang w:eastAsia="sv-SE"/>
           <w14:ligatures w14:val="none"/>
         </w:rPr>
-        <w:t>3. Backendkrav</w:t>
-      </w:r>
+        <w:t xml:space="preserve">3. </w:t>
+      </w:r>
+      <w:proofErr w:type="spellStart"/>
+      <w:r>
+        <w:rPr>
+          <w:rFonts w:ascii="Times New Roman" w:eastAsia="Times New Roman" w:hAnsi="Times New Roman" w:cs="Times New Roman"/>
+          <w:b/>
+          <w:bCs/>
+          <w:kern w:val="0"/>
+          <w:sz w:val="36"/>
+          <w:szCs w:val="36"/>
+          <w:lang w:eastAsia="sv-SE"/>
+          <w14:ligatures w14:val="none"/>
+        </w:rPr>
+        <w:t>Backendkrav</w:t>
+      </w:r>
+      <w:proofErr w:type="spellEnd"/>
     </w:p>
     <w:p>
       <w:pPr>
@@ -1483,7 +1739,27 @@
           <w:lang w:eastAsia="sv-SE"/>
           <w14:ligatures w14:val="none"/>
         </w:rPr>
-        <w:t xml:space="preserve">BE1: GET /products </w:t>
+        <w:t>BE1: GET /</w:t>
+      </w:r>
+      <w:proofErr w:type="spellStart"/>
+      <w:r>
+        <w:rPr>
+          <w:rFonts w:ascii="Times New Roman" w:eastAsia="Times New Roman" w:hAnsi="Times New Roman" w:cs="Times New Roman"/>
+          <w:kern w:val="0"/>
+          <w:lang w:eastAsia="sv-SE"/>
+          <w14:ligatures w14:val="none"/>
+        </w:rPr>
+        <w:t>products</w:t>
+      </w:r>
+      <w:proofErr w:type="spellEnd"/>
+      <w:r>
+        <w:rPr>
+          <w:rFonts w:ascii="Times New Roman" w:eastAsia="Times New Roman" w:hAnsi="Times New Roman" w:cs="Times New Roman"/>
+          <w:kern w:val="0"/>
+          <w:lang w:eastAsia="sv-SE"/>
+          <w14:ligatures w14:val="none"/>
+        </w:rPr>
+        <w:t xml:space="preserve"> </w:t>
       </w:r>
     </w:p>
     <w:p>
@@ -1531,7 +1807,27 @@
           <w:lang w:eastAsia="sv-SE"/>
           <w14:ligatures w14:val="none"/>
         </w:rPr>
-        <w:t xml:space="preserve">BE3: GET /users </w:t>
+        <w:t>BE3: GET /</w:t>
+      </w:r>
+      <w:proofErr w:type="spellStart"/>
+      <w:r>
+        <w:rPr>
+          <w:rFonts w:ascii="Times New Roman" w:eastAsia="Times New Roman" w:hAnsi="Times New Roman" w:cs="Times New Roman"/>
+          <w:kern w:val="0"/>
+          <w:lang w:eastAsia="sv-SE"/>
+          <w14:ligatures w14:val="none"/>
+        </w:rPr>
+        <w:t>users</w:t>
+      </w:r>
+      <w:proofErr w:type="spellEnd"/>
+      <w:r>
+        <w:rPr>
+          <w:rFonts w:ascii="Times New Roman" w:eastAsia="Times New Roman" w:hAnsi="Times New Roman" w:cs="Times New Roman"/>
+          <w:kern w:val="0"/>
+          <w:lang w:eastAsia="sv-SE"/>
+          <w14:ligatures w14:val="none"/>
+        </w:rPr>
+        <w:t xml:space="preserve"> </w:t>
       </w:r>
     </w:p>
     <w:p>
@@ -1632,6 +1928,7 @@
           <w:lang w:eastAsia="sv-SE"/>
           <w14:ligatures w14:val="none"/>
         </w:rPr>
+        <w:lastRenderedPageBreak/>
         <w:t xml:space="preserve">BE6: Lagra produkter </w:t>
       </w:r>
     </w:p>
@@ -1834,7 +2131,27 @@
           <w:lang w:eastAsia="sv-SE"/>
           <w14:ligatures w14:val="none"/>
         </w:rPr>
-        <w:t xml:space="preserve">BE12: Skydda endpoints </w:t>
+        <w:t xml:space="preserve">BE12: Skydda </w:t>
+      </w:r>
+      <w:proofErr w:type="spellStart"/>
+      <w:r>
+        <w:rPr>
+          <w:rFonts w:ascii="Times New Roman" w:eastAsia="Times New Roman" w:hAnsi="Times New Roman" w:cs="Times New Roman"/>
+          <w:kern w:val="0"/>
+          <w:lang w:eastAsia="sv-SE"/>
+          <w14:ligatures w14:val="none"/>
+        </w:rPr>
+        <w:t>endpoints</w:t>
+      </w:r>
+      <w:proofErr w:type="spellEnd"/>
+      <w:r>
+        <w:rPr>
+          <w:rFonts w:ascii="Times New Roman" w:eastAsia="Times New Roman" w:hAnsi="Times New Roman" w:cs="Times New Roman"/>
+          <w:kern w:val="0"/>
+          <w:lang w:eastAsia="sv-SE"/>
+          <w14:ligatures w14:val="none"/>
+        </w:rPr>
+        <w:t xml:space="preserve"> </w:t>
       </w:r>
     </w:p>
     <w:p>
@@ -1909,7 +2226,47 @@
           <w:lang w:eastAsia="sv-SE"/>
           <w14:ligatures w14:val="none"/>
         </w:rPr>
-        <w:t xml:space="preserve">IN1: Frontend hämtar produkter från backend </w:t>
+        <w:t xml:space="preserve">IN1: </w:t>
+      </w:r>
+      <w:proofErr w:type="spellStart"/>
+      <w:r>
+        <w:rPr>
+          <w:rFonts w:ascii="Times New Roman" w:eastAsia="Times New Roman" w:hAnsi="Times New Roman" w:cs="Times New Roman"/>
+          <w:kern w:val="0"/>
+          <w:lang w:eastAsia="sv-SE"/>
+          <w14:ligatures w14:val="none"/>
+        </w:rPr>
+        <w:t>Frontend</w:t>
+      </w:r>
+      <w:proofErr w:type="spellEnd"/>
+      <w:r>
+        <w:rPr>
+          <w:rFonts w:ascii="Times New Roman" w:eastAsia="Times New Roman" w:hAnsi="Times New Roman" w:cs="Times New Roman"/>
+          <w:kern w:val="0"/>
+          <w:lang w:eastAsia="sv-SE"/>
+          <w14:ligatures w14:val="none"/>
+        </w:rPr>
+        <w:t xml:space="preserve"> hämtar produkter från </w:t>
+      </w:r>
+      <w:proofErr w:type="spellStart"/>
+      <w:r>
+        <w:rPr>
+          <w:rFonts w:ascii="Times New Roman" w:eastAsia="Times New Roman" w:hAnsi="Times New Roman" w:cs="Times New Roman"/>
+          <w:kern w:val="0"/>
+          <w:lang w:eastAsia="sv-SE"/>
+          <w14:ligatures w14:val="none"/>
+        </w:rPr>
+        <w:t>backend</w:t>
+      </w:r>
+      <w:proofErr w:type="spellEnd"/>
+      <w:r>
+        <w:rPr>
+          <w:rFonts w:ascii="Times New Roman" w:eastAsia="Times New Roman" w:hAnsi="Times New Roman" w:cs="Times New Roman"/>
+          <w:kern w:val="0"/>
+          <w:lang w:eastAsia="sv-SE"/>
+          <w14:ligatures w14:val="none"/>
+        </w:rPr>
+        <w:t xml:space="preserve"> </w:t>
       </w:r>
     </w:p>
     <w:p>
@@ -1933,7 +2290,47 @@
           <w:lang w:eastAsia="sv-SE"/>
           <w14:ligatures w14:val="none"/>
         </w:rPr>
-        <w:t xml:space="preserve">IN2: Frontend skickar orders till backend </w:t>
+        <w:t xml:space="preserve">IN2: </w:t>
+      </w:r>
+      <w:proofErr w:type="spellStart"/>
+      <w:r>
+        <w:rPr>
+          <w:rFonts w:ascii="Times New Roman" w:eastAsia="Times New Roman" w:hAnsi="Times New Roman" w:cs="Times New Roman"/>
+          <w:kern w:val="0"/>
+          <w:lang w:eastAsia="sv-SE"/>
+          <w14:ligatures w14:val="none"/>
+        </w:rPr>
+        <w:t>Frontend</w:t>
+      </w:r>
+      <w:proofErr w:type="spellEnd"/>
+      <w:r>
+        <w:rPr>
+          <w:rFonts w:ascii="Times New Roman" w:eastAsia="Times New Roman" w:hAnsi="Times New Roman" w:cs="Times New Roman"/>
+          <w:kern w:val="0"/>
+          <w:lang w:eastAsia="sv-SE"/>
+          <w14:ligatures w14:val="none"/>
+        </w:rPr>
+        <w:t xml:space="preserve"> skickar orders till </w:t>
+      </w:r>
+      <w:proofErr w:type="spellStart"/>
+      <w:r>
+        <w:rPr>
+          <w:rFonts w:ascii="Times New Roman" w:eastAsia="Times New Roman" w:hAnsi="Times New Roman" w:cs="Times New Roman"/>
+          <w:kern w:val="0"/>
+          <w:lang w:eastAsia="sv-SE"/>
+          <w14:ligatures w14:val="none"/>
+        </w:rPr>
+        <w:t>backend</w:t>
+      </w:r>
+      <w:proofErr w:type="spellEnd"/>
+      <w:r>
+        <w:rPr>
+          <w:rFonts w:ascii="Times New Roman" w:eastAsia="Times New Roman" w:hAnsi="Times New Roman" w:cs="Times New Roman"/>
+          <w:kern w:val="0"/>
+          <w:lang w:eastAsia="sv-SE"/>
+          <w14:ligatures w14:val="none"/>
+        </w:rPr>
+        <w:t xml:space="preserve"> </w:t>
       </w:r>
     </w:p>
     <w:p>
@@ -1957,7 +2354,27 @@
           <w:lang w:eastAsia="sv-SE"/>
           <w14:ligatures w14:val="none"/>
         </w:rPr>
-        <w:t xml:space="preserve">IN3: Frontend skickar login/register </w:t>
+        <w:t xml:space="preserve">IN3: </w:t>
+      </w:r>
+      <w:proofErr w:type="spellStart"/>
+      <w:r>
+        <w:rPr>
+          <w:rFonts w:ascii="Times New Roman" w:eastAsia="Times New Roman" w:hAnsi="Times New Roman" w:cs="Times New Roman"/>
+          <w:kern w:val="0"/>
+          <w:lang w:eastAsia="sv-SE"/>
+          <w14:ligatures w14:val="none"/>
+        </w:rPr>
+        <w:t>Frontend</w:t>
+      </w:r>
+      <w:proofErr w:type="spellEnd"/>
+      <w:r>
+        <w:rPr>
+          <w:rFonts w:ascii="Times New Roman" w:eastAsia="Times New Roman" w:hAnsi="Times New Roman" w:cs="Times New Roman"/>
+          <w:kern w:val="0"/>
+          <w:lang w:eastAsia="sv-SE"/>
+          <w14:ligatures w14:val="none"/>
+        </w:rPr>
+        <w:t xml:space="preserve"> skickar login/register </w:t>
       </w:r>
     </w:p>
     <w:p>
@@ -1981,7 +2398,27 @@
           <w:lang w:eastAsia="sv-SE"/>
           <w14:ligatures w14:val="none"/>
         </w:rPr>
-        <w:t xml:space="preserve">IN4: Frontend hanterar JWT </w:t>
+        <w:t xml:space="preserve">IN4: </w:t>
+      </w:r>
+      <w:proofErr w:type="spellStart"/>
+      <w:r>
+        <w:rPr>
+          <w:rFonts w:ascii="Times New Roman" w:eastAsia="Times New Roman" w:hAnsi="Times New Roman" w:cs="Times New Roman"/>
+          <w:kern w:val="0"/>
+          <w:lang w:eastAsia="sv-SE"/>
+          <w14:ligatures w14:val="none"/>
+        </w:rPr>
+        <w:t>Frontend</w:t>
+      </w:r>
+      <w:proofErr w:type="spellEnd"/>
+      <w:r>
+        <w:rPr>
+          <w:rFonts w:ascii="Times New Roman" w:eastAsia="Times New Roman" w:hAnsi="Times New Roman" w:cs="Times New Roman"/>
+          <w:kern w:val="0"/>
+          <w:lang w:eastAsia="sv-SE"/>
+          <w14:ligatures w14:val="none"/>
+        </w:rPr>
+        <w:t xml:space="preserve"> hanterar JWT </w:t>
       </w:r>
     </w:p>
     <w:p>
@@ -2032,7 +2469,35 @@
           <w:lang w:eastAsia="sv-SE"/>
           <w14:ligatures w14:val="none"/>
         </w:rPr>
-        <w:t>5. Komponenter (Frontend)</w:t>
+        <w:t>5. Komponenter (</w:t>
+      </w:r>
+      <w:proofErr w:type="spellStart"/>
+      <w:r>
+        <w:rPr>
+          <w:rFonts w:ascii="Times New Roman" w:eastAsia="Times New Roman" w:hAnsi="Times New Roman" w:cs="Times New Roman"/>
+          <w:b/>
+          <w:bCs/>
+          <w:kern w:val="0"/>
+          <w:sz w:val="36"/>
+          <w:szCs w:val="36"/>
+          <w:lang w:eastAsia="sv-SE"/>
+          <w14:ligatures w14:val="none"/>
+        </w:rPr>
+        <w:t>Frontend</w:t>
+      </w:r>
+      <w:proofErr w:type="spellEnd"/>
+      <w:r>
+        <w:rPr>
+          <w:rFonts w:ascii="Times New Roman" w:eastAsia="Times New Roman" w:hAnsi="Times New Roman" w:cs="Times New Roman"/>
+          <w:b/>
+          <w:bCs/>
+          <w:kern w:val="0"/>
+          <w:sz w:val="36"/>
+          <w:szCs w:val="36"/>
+          <w:lang w:eastAsia="sv-SE"/>
+          <w14:ligatures w14:val="none"/>
+        </w:rPr>
+        <w:t>)</w:t>
       </w:r>
     </w:p>
     <w:p>
@@ -2085,7 +2550,27 @@
           <w:lang w:eastAsia="sv-SE"/>
           <w14:ligatures w14:val="none"/>
         </w:rPr>
-        <w:t xml:space="preserve">C1: Home </w:t>
+        <w:t xml:space="preserve">C1: </w:t>
+      </w:r>
+      <w:proofErr w:type="spellStart"/>
+      <w:r>
+        <w:rPr>
+          <w:rFonts w:ascii="Times New Roman" w:eastAsia="Times New Roman" w:hAnsi="Times New Roman" w:cs="Times New Roman"/>
+          <w:kern w:val="0"/>
+          <w:lang w:eastAsia="sv-SE"/>
+          <w14:ligatures w14:val="none"/>
+        </w:rPr>
+        <w:t>Home</w:t>
+      </w:r>
+      <w:proofErr w:type="spellEnd"/>
+      <w:r>
+        <w:rPr>
+          <w:rFonts w:ascii="Times New Roman" w:eastAsia="Times New Roman" w:hAnsi="Times New Roman" w:cs="Times New Roman"/>
+          <w:kern w:val="0"/>
+          <w:lang w:eastAsia="sv-SE"/>
+          <w14:ligatures w14:val="none"/>
+        </w:rPr>
+        <w:t xml:space="preserve"> </w:t>
       </w:r>
     </w:p>
     <w:p>
@@ -2109,7 +2594,27 @@
           <w:lang w:eastAsia="sv-SE"/>
           <w14:ligatures w14:val="none"/>
         </w:rPr>
-        <w:t xml:space="preserve">C2: ProductList </w:t>
+        <w:t xml:space="preserve">C2: </w:t>
+      </w:r>
+      <w:proofErr w:type="spellStart"/>
+      <w:r>
+        <w:rPr>
+          <w:rFonts w:ascii="Times New Roman" w:eastAsia="Times New Roman" w:hAnsi="Times New Roman" w:cs="Times New Roman"/>
+          <w:kern w:val="0"/>
+          <w:lang w:eastAsia="sv-SE"/>
+          <w14:ligatures w14:val="none"/>
+        </w:rPr>
+        <w:t>ProductList</w:t>
+      </w:r>
+      <w:proofErr w:type="spellEnd"/>
+      <w:r>
+        <w:rPr>
+          <w:rFonts w:ascii="Times New Roman" w:eastAsia="Times New Roman" w:hAnsi="Times New Roman" w:cs="Times New Roman"/>
+          <w:kern w:val="0"/>
+          <w:lang w:eastAsia="sv-SE"/>
+          <w14:ligatures w14:val="none"/>
+        </w:rPr>
+        <w:t xml:space="preserve"> </w:t>
       </w:r>
     </w:p>
     <w:p>
@@ -2133,7 +2638,27 @@
           <w:lang w:eastAsia="sv-SE"/>
           <w14:ligatures w14:val="none"/>
         </w:rPr>
-        <w:t xml:space="preserve">C3: ProductCard </w:t>
+        <w:t xml:space="preserve">C3: </w:t>
+      </w:r>
+      <w:proofErr w:type="spellStart"/>
+      <w:r>
+        <w:rPr>
+          <w:rFonts w:ascii="Times New Roman" w:eastAsia="Times New Roman" w:hAnsi="Times New Roman" w:cs="Times New Roman"/>
+          <w:kern w:val="0"/>
+          <w:lang w:eastAsia="sv-SE"/>
+          <w14:ligatures w14:val="none"/>
+        </w:rPr>
+        <w:t>ProductCard</w:t>
+      </w:r>
+      <w:proofErr w:type="spellEnd"/>
+      <w:r>
+        <w:rPr>
+          <w:rFonts w:ascii="Times New Roman" w:eastAsia="Times New Roman" w:hAnsi="Times New Roman" w:cs="Times New Roman"/>
+          <w:kern w:val="0"/>
+          <w:lang w:eastAsia="sv-SE"/>
+          <w14:ligatures w14:val="none"/>
+        </w:rPr>
+        <w:t xml:space="preserve"> </w:t>
       </w:r>
     </w:p>
     <w:p>
@@ -2181,7 +2706,27 @@
           <w:lang w:eastAsia="sv-SE"/>
           <w14:ligatures w14:val="none"/>
         </w:rPr>
-        <w:t xml:space="preserve">C5: Cart </w:t>
+        <w:t xml:space="preserve">C5: </w:t>
+      </w:r>
+      <w:proofErr w:type="spellStart"/>
+      <w:r>
+        <w:rPr>
+          <w:rFonts w:ascii="Times New Roman" w:eastAsia="Times New Roman" w:hAnsi="Times New Roman" w:cs="Times New Roman"/>
+          <w:kern w:val="0"/>
+          <w:lang w:eastAsia="sv-SE"/>
+          <w14:ligatures w14:val="none"/>
+        </w:rPr>
+        <w:t>Cart</w:t>
+      </w:r>
+      <w:proofErr w:type="spellEnd"/>
+      <w:r>
+        <w:rPr>
+          <w:rFonts w:ascii="Times New Roman" w:eastAsia="Times New Roman" w:hAnsi="Times New Roman" w:cs="Times New Roman"/>
+          <w:kern w:val="0"/>
+          <w:lang w:eastAsia="sv-SE"/>
+          <w14:ligatures w14:val="none"/>
+        </w:rPr>
+        <w:t xml:space="preserve"> </w:t>
       </w:r>
     </w:p>
     <w:p>
@@ -2205,8 +2750,27 @@
           <w:lang w:eastAsia="sv-SE"/>
           <w14:ligatures w14:val="none"/>
         </w:rPr>
-        <w:lastRenderedPageBreak/>
-        <w:t xml:space="preserve">C6: CartItem </w:t>
+        <w:t xml:space="preserve">C6: </w:t>
+      </w:r>
+      <w:proofErr w:type="spellStart"/>
+      <w:r>
+        <w:rPr>
+          <w:rFonts w:ascii="Times New Roman" w:eastAsia="Times New Roman" w:hAnsi="Times New Roman" w:cs="Times New Roman"/>
+          <w:kern w:val="0"/>
+          <w:lang w:eastAsia="sv-SE"/>
+          <w14:ligatures w14:val="none"/>
+        </w:rPr>
+        <w:t>CartItem</w:t>
+      </w:r>
+      <w:proofErr w:type="spellEnd"/>
+      <w:r>
+        <w:rPr>
+          <w:rFonts w:ascii="Times New Roman" w:eastAsia="Times New Roman" w:hAnsi="Times New Roman" w:cs="Times New Roman"/>
+          <w:kern w:val="0"/>
+          <w:lang w:eastAsia="sv-SE"/>
+          <w14:ligatures w14:val="none"/>
+        </w:rPr>
+        <w:t xml:space="preserve"> </w:t>
       </w:r>
     </w:p>
     <w:p>
@@ -2230,7 +2794,27 @@
           <w:lang w:eastAsia="sv-SE"/>
           <w14:ligatures w14:val="none"/>
         </w:rPr>
-        <w:t xml:space="preserve">C7: Checkout </w:t>
+        <w:t xml:space="preserve">C7: </w:t>
+      </w:r>
+      <w:proofErr w:type="spellStart"/>
+      <w:r>
+        <w:rPr>
+          <w:rFonts w:ascii="Times New Roman" w:eastAsia="Times New Roman" w:hAnsi="Times New Roman" w:cs="Times New Roman"/>
+          <w:kern w:val="0"/>
+          <w:lang w:eastAsia="sv-SE"/>
+          <w14:ligatures w14:val="none"/>
+        </w:rPr>
+        <w:t>Checkout</w:t>
+      </w:r>
+      <w:proofErr w:type="spellEnd"/>
+      <w:r>
+        <w:rPr>
+          <w:rFonts w:ascii="Times New Roman" w:eastAsia="Times New Roman" w:hAnsi="Times New Roman" w:cs="Times New Roman"/>
+          <w:kern w:val="0"/>
+          <w:lang w:eastAsia="sv-SE"/>
+          <w14:ligatures w14:val="none"/>
+        </w:rPr>
+        <w:t xml:space="preserve"> </w:t>
       </w:r>
     </w:p>
     <w:p>
@@ -2254,7 +2838,27 @@
           <w:lang w:eastAsia="sv-SE"/>
           <w14:ligatures w14:val="none"/>
         </w:rPr>
-        <w:t xml:space="preserve">C8: PaymentForm </w:t>
+        <w:t xml:space="preserve">C8: </w:t>
+      </w:r>
+      <w:proofErr w:type="spellStart"/>
+      <w:r>
+        <w:rPr>
+          <w:rFonts w:ascii="Times New Roman" w:eastAsia="Times New Roman" w:hAnsi="Times New Roman" w:cs="Times New Roman"/>
+          <w:kern w:val="0"/>
+          <w:lang w:eastAsia="sv-SE"/>
+          <w14:ligatures w14:val="none"/>
+        </w:rPr>
+        <w:t>PaymentForm</w:t>
+      </w:r>
+      <w:proofErr w:type="spellEnd"/>
+      <w:r>
+        <w:rPr>
+          <w:rFonts w:ascii="Times New Roman" w:eastAsia="Times New Roman" w:hAnsi="Times New Roman" w:cs="Times New Roman"/>
+          <w:kern w:val="0"/>
+          <w:lang w:eastAsia="sv-SE"/>
+          <w14:ligatures w14:val="none"/>
+        </w:rPr>
+        <w:t xml:space="preserve"> </w:t>
       </w:r>
     </w:p>
     <w:p>
@@ -2278,7 +2882,27 @@
           <w:lang w:eastAsia="sv-SE"/>
           <w14:ligatures w14:val="none"/>
         </w:rPr>
-        <w:t xml:space="preserve">C9: Confirmation </w:t>
+        <w:t xml:space="preserve">C9: </w:t>
+      </w:r>
+      <w:proofErr w:type="spellStart"/>
+      <w:r>
+        <w:rPr>
+          <w:rFonts w:ascii="Times New Roman" w:eastAsia="Times New Roman" w:hAnsi="Times New Roman" w:cs="Times New Roman"/>
+          <w:kern w:val="0"/>
+          <w:lang w:eastAsia="sv-SE"/>
+          <w14:ligatures w14:val="none"/>
+        </w:rPr>
+        <w:t>Confirmation</w:t>
+      </w:r>
+      <w:proofErr w:type="spellEnd"/>
+      <w:r>
+        <w:rPr>
+          <w:rFonts w:ascii="Times New Roman" w:eastAsia="Times New Roman" w:hAnsi="Times New Roman" w:cs="Times New Roman"/>
+          <w:kern w:val="0"/>
+          <w:lang w:eastAsia="sv-SE"/>
+          <w14:ligatures w14:val="none"/>
+        </w:rPr>
+        <w:t xml:space="preserve"> </w:t>
       </w:r>
     </w:p>
     <w:p>
@@ -2302,7 +2926,27 @@
           <w:lang w:eastAsia="sv-SE"/>
           <w14:ligatures w14:val="none"/>
         </w:rPr>
-        <w:t xml:space="preserve">C10: Navbar </w:t>
+        <w:t xml:space="preserve">C10: </w:t>
+      </w:r>
+      <w:proofErr w:type="spellStart"/>
+      <w:r>
+        <w:rPr>
+          <w:rFonts w:ascii="Times New Roman" w:eastAsia="Times New Roman" w:hAnsi="Times New Roman" w:cs="Times New Roman"/>
+          <w:kern w:val="0"/>
+          <w:lang w:eastAsia="sv-SE"/>
+          <w14:ligatures w14:val="none"/>
+        </w:rPr>
+        <w:t>Navbar</w:t>
+      </w:r>
+      <w:proofErr w:type="spellEnd"/>
+      <w:r>
+        <w:rPr>
+          <w:rFonts w:ascii="Times New Roman" w:eastAsia="Times New Roman" w:hAnsi="Times New Roman" w:cs="Times New Roman"/>
+          <w:kern w:val="0"/>
+          <w:lang w:eastAsia="sv-SE"/>
+          <w14:ligatures w14:val="none"/>
+        </w:rPr>
+        <w:t xml:space="preserve"> </w:t>
       </w:r>
     </w:p>
     <w:p>
@@ -2436,7 +3080,27 @@
           <w:lang w:eastAsia="sv-SE"/>
           <w14:ligatures w14:val="none"/>
         </w:rPr>
-        <w:t xml:space="preserve">C13: Favorites </w:t>
+        <w:t xml:space="preserve">C13: </w:t>
+      </w:r>
+      <w:proofErr w:type="spellStart"/>
+      <w:r>
+        <w:rPr>
+          <w:rFonts w:ascii="Times New Roman" w:eastAsia="Times New Roman" w:hAnsi="Times New Roman" w:cs="Times New Roman"/>
+          <w:kern w:val="0"/>
+          <w:lang w:eastAsia="sv-SE"/>
+          <w14:ligatures w14:val="none"/>
+        </w:rPr>
+        <w:t>Favorites</w:t>
+      </w:r>
+      <w:proofErr w:type="spellEnd"/>
+      <w:r>
+        <w:rPr>
+          <w:rFonts w:ascii="Times New Roman" w:eastAsia="Times New Roman" w:hAnsi="Times New Roman" w:cs="Times New Roman"/>
+          <w:kern w:val="0"/>
+          <w:lang w:eastAsia="sv-SE"/>
+          <w14:ligatures w14:val="none"/>
+        </w:rPr>
+        <w:t xml:space="preserve"> </w:t>
       </w:r>
     </w:p>
     <w:p>
@@ -2460,7 +3124,27 @@
           <w:lang w:eastAsia="sv-SE"/>
           <w14:ligatures w14:val="none"/>
         </w:rPr>
-        <w:t xml:space="preserve">C14: FavoriteItem </w:t>
+        <w:t xml:space="preserve">C14: </w:t>
+      </w:r>
+      <w:proofErr w:type="spellStart"/>
+      <w:r>
+        <w:rPr>
+          <w:rFonts w:ascii="Times New Roman" w:eastAsia="Times New Roman" w:hAnsi="Times New Roman" w:cs="Times New Roman"/>
+          <w:kern w:val="0"/>
+          <w:lang w:eastAsia="sv-SE"/>
+          <w14:ligatures w14:val="none"/>
+        </w:rPr>
+        <w:t>FavoriteItem</w:t>
+      </w:r>
+      <w:proofErr w:type="spellEnd"/>
+      <w:r>
+        <w:rPr>
+          <w:rFonts w:ascii="Times New Roman" w:eastAsia="Times New Roman" w:hAnsi="Times New Roman" w:cs="Times New Roman"/>
+          <w:kern w:val="0"/>
+          <w:lang w:eastAsia="sv-SE"/>
+          <w14:ligatures w14:val="none"/>
+        </w:rPr>
+        <w:t xml:space="preserve"> </w:t>
       </w:r>
     </w:p>
     <w:p>
@@ -2484,7 +3168,27 @@
           <w:lang w:eastAsia="sv-SE"/>
           <w14:ligatures w14:val="none"/>
         </w:rPr>
-        <w:t xml:space="preserve">C15: FavoriteButton </w:t>
+        <w:t xml:space="preserve">C15: </w:t>
+      </w:r>
+      <w:proofErr w:type="spellStart"/>
+      <w:r>
+        <w:rPr>
+          <w:rFonts w:ascii="Times New Roman" w:eastAsia="Times New Roman" w:hAnsi="Times New Roman" w:cs="Times New Roman"/>
+          <w:kern w:val="0"/>
+          <w:lang w:eastAsia="sv-SE"/>
+          <w14:ligatures w14:val="none"/>
+        </w:rPr>
+        <w:t>FavoriteButton</w:t>
+      </w:r>
+      <w:proofErr w:type="spellEnd"/>
+      <w:r>
+        <w:rPr>
+          <w:rFonts w:ascii="Times New Roman" w:eastAsia="Times New Roman" w:hAnsi="Times New Roman" w:cs="Times New Roman"/>
+          <w:kern w:val="0"/>
+          <w:lang w:eastAsia="sv-SE"/>
+          <w14:ligatures w14:val="none"/>
+        </w:rPr>
+        <w:t xml:space="preserve"> </w:t>
       </w:r>
     </w:p>
     <w:p>
@@ -2504,6 +3208,7 @@
           <w:lang w:eastAsia="sv-SE"/>
           <w14:ligatures w14:val="none"/>
         </w:rPr>
+        <w:lastRenderedPageBreak/>
         <w:pict w14:anchorId="6BA0742C">
           <v:rect id="_x0000_i1030" style="width:0;height:1.5pt" o:hralign="center" o:hrstd="t" o:hr="t" fillcolor="#a0a0a0" stroked="f"/>
         </w:pict>
@@ -2535,8 +3240,51 @@
           <w:lang w:eastAsia="sv-SE"/>
           <w14:ligatures w14:val="none"/>
         </w:rPr>
-        <w:t>6. User Stories</w:t>
-      </w:r>
+        <w:t xml:space="preserve">6. </w:t>
+      </w:r>
+      <w:proofErr w:type="spellStart"/>
+      <w:r>
+        <w:rPr>
+          <w:rFonts w:ascii="Times New Roman" w:eastAsia="Times New Roman" w:hAnsi="Times New Roman" w:cs="Times New Roman"/>
+          <w:b/>
+          <w:bCs/>
+          <w:kern w:val="0"/>
+          <w:sz w:val="36"/>
+          <w:szCs w:val="36"/>
+          <w:lang w:eastAsia="sv-SE"/>
+          <w14:ligatures w14:val="none"/>
+        </w:rPr>
+        <w:t>User</w:t>
+      </w:r>
+      <w:proofErr w:type="spellEnd"/>
+      <w:r>
+        <w:rPr>
+          <w:rFonts w:ascii="Times New Roman" w:eastAsia="Times New Roman" w:hAnsi="Times New Roman" w:cs="Times New Roman"/>
+          <w:b/>
+          <w:bCs/>
+          <w:kern w:val="0"/>
+          <w:sz w:val="36"/>
+          <w:szCs w:val="36"/>
+          <w:lang w:eastAsia="sv-SE"/>
+          <w14:ligatures w14:val="none"/>
+        </w:rPr>
+        <w:t xml:space="preserve"> </w:t>
+      </w:r>
+      <w:proofErr w:type="spellStart"/>
+      <w:r>
+        <w:rPr>
+          <w:rFonts w:ascii="Times New Roman" w:eastAsia="Times New Roman" w:hAnsi="Times New Roman" w:cs="Times New Roman"/>
+          <w:b/>
+          <w:bCs/>
+          <w:kern w:val="0"/>
+          <w:sz w:val="36"/>
+          <w:szCs w:val="36"/>
+          <w:lang w:eastAsia="sv-SE"/>
+          <w14:ligatures w14:val="none"/>
+        </w:rPr>
+        <w:t>Stories</w:t>
+      </w:r>
+      <w:proofErr w:type="spellEnd"/>
     </w:p>
     <w:p>
       <w:pPr>
@@ -2930,7 +3678,27 @@
           <w:lang w:eastAsia="sv-SE"/>
           <w14:ligatures w14:val="none"/>
         </w:rPr>
-        <w:t xml:space="preserve">TR1: React </w:t>
+        <w:t xml:space="preserve">TR1: </w:t>
+      </w:r>
+      <w:proofErr w:type="spellStart"/>
+      <w:r>
+        <w:rPr>
+          <w:rFonts w:ascii="Times New Roman" w:eastAsia="Times New Roman" w:hAnsi="Times New Roman" w:cs="Times New Roman"/>
+          <w:kern w:val="0"/>
+          <w:lang w:eastAsia="sv-SE"/>
+          <w14:ligatures w14:val="none"/>
+        </w:rPr>
+        <w:t>React</w:t>
+      </w:r>
+      <w:proofErr w:type="spellEnd"/>
+      <w:r>
+        <w:rPr>
+          <w:rFonts w:ascii="Times New Roman" w:eastAsia="Times New Roman" w:hAnsi="Times New Roman" w:cs="Times New Roman"/>
+          <w:kern w:val="0"/>
+          <w:lang w:eastAsia="sv-SE"/>
+          <w14:ligatures w14:val="none"/>
+        </w:rPr>
+        <w:t xml:space="preserve"> </w:t>
       </w:r>
     </w:p>
     <w:p>
@@ -2954,7 +3722,27 @@
           <w:lang w:eastAsia="sv-SE"/>
           <w14:ligatures w14:val="none"/>
         </w:rPr>
-        <w:t xml:space="preserve">TR2: React Router </w:t>
+        <w:t xml:space="preserve">TR2: </w:t>
+      </w:r>
+      <w:proofErr w:type="spellStart"/>
+      <w:r>
+        <w:rPr>
+          <w:rFonts w:ascii="Times New Roman" w:eastAsia="Times New Roman" w:hAnsi="Times New Roman" w:cs="Times New Roman"/>
+          <w:kern w:val="0"/>
+          <w:lang w:eastAsia="sv-SE"/>
+          <w14:ligatures w14:val="none"/>
+        </w:rPr>
+        <w:t>React</w:t>
+      </w:r>
+      <w:proofErr w:type="spellEnd"/>
+      <w:r>
+        <w:rPr>
+          <w:rFonts w:ascii="Times New Roman" w:eastAsia="Times New Roman" w:hAnsi="Times New Roman" w:cs="Times New Roman"/>
+          <w:kern w:val="0"/>
+          <w:lang w:eastAsia="sv-SE"/>
+          <w14:ligatures w14:val="none"/>
+        </w:rPr>
+        <w:t xml:space="preserve"> Router </w:t>
       </w:r>
     </w:p>
     <w:p>
@@ -2978,7 +3766,27 @@
           <w:lang w:eastAsia="sv-SE"/>
           <w14:ligatures w14:val="none"/>
         </w:rPr>
-        <w:t xml:space="preserve">TR3: json-server (G) </w:t>
+        <w:t xml:space="preserve">TR3: </w:t>
+      </w:r>
+      <w:proofErr w:type="spellStart"/>
+      <w:r>
+        <w:rPr>
+          <w:rFonts w:ascii="Times New Roman" w:eastAsia="Times New Roman" w:hAnsi="Times New Roman" w:cs="Times New Roman"/>
+          <w:kern w:val="0"/>
+          <w:lang w:eastAsia="sv-SE"/>
+          <w14:ligatures w14:val="none"/>
+        </w:rPr>
+        <w:t>json</w:t>
+      </w:r>
+      <w:proofErr w:type="spellEnd"/>
+      <w:r>
+        <w:rPr>
+          <w:rFonts w:ascii="Times New Roman" w:eastAsia="Times New Roman" w:hAnsi="Times New Roman" w:cs="Times New Roman"/>
+          <w:kern w:val="0"/>
+          <w:lang w:eastAsia="sv-SE"/>
+          <w14:ligatures w14:val="none"/>
+        </w:rPr>
+        <w:t xml:space="preserve">-server (G) </w:t>
       </w:r>
     </w:p>
     <w:p>
@@ -3042,7 +3850,6 @@
           <w:lang w:eastAsia="sv-SE"/>
           <w14:ligatures w14:val="none"/>
         </w:rPr>
-        <w:lastRenderedPageBreak/>
         <w:t>8</w:t>
       </w:r>
       <w:r>
@@ -3156,7 +3963,29 @@
           <w:lang w:eastAsia="sv-SE"/>
           <w14:ligatures w14:val="none"/>
         </w:rPr>
-        <w:t>om appens upplägg.</w:t>
+        <w:t xml:space="preserve">om </w:t>
+      </w:r>
+      <w:proofErr w:type="spellStart"/>
+      <w:r>
+        <w:rPr>
+          <w:rFonts w:ascii="Times New Roman" w:eastAsia="Times New Roman" w:hAnsi="Times New Roman" w:cs="Times New Roman"/>
+          <w:kern w:val="0"/>
+          <w:highlight w:val="green"/>
+          <w:lang w:eastAsia="sv-SE"/>
+          <w14:ligatures w14:val="none"/>
+        </w:rPr>
+        <w:t>appens</w:t>
+      </w:r>
+      <w:proofErr w:type="spellEnd"/>
+      <w:r>
+        <w:rPr>
+          <w:rFonts w:ascii="Times New Roman" w:eastAsia="Times New Roman" w:hAnsi="Times New Roman" w:cs="Times New Roman"/>
+          <w:kern w:val="0"/>
+          <w:highlight w:val="green"/>
+          <w:lang w:eastAsia="sv-SE"/>
+          <w14:ligatures w14:val="none"/>
+        </w:rPr>
+        <w:t xml:space="preserve"> upplägg.</w:t>
       </w:r>
     </w:p>
     <w:p>
@@ -3176,8 +4005,19 @@
           <w:lang w:eastAsia="sv-SE"/>
           <w14:ligatures w14:val="none"/>
         </w:rPr>
-        <w:t>Fas 2 – Design i Figma</w:t>
-      </w:r>
+        <w:t xml:space="preserve">Fas 2 – Design i </w:t>
+      </w:r>
+      <w:proofErr w:type="spellStart"/>
+      <w:r>
+        <w:rPr>
+          <w:rFonts w:ascii="Times New Roman" w:eastAsia="Times New Roman" w:hAnsi="Times New Roman" w:cs="Times New Roman"/>
+          <w:kern w:val="0"/>
+          <w:lang w:eastAsia="sv-SE"/>
+          <w14:ligatures w14:val="none"/>
+        </w:rPr>
+        <w:t>Figma</w:t>
+      </w:r>
+      <w:proofErr w:type="spellEnd"/>
     </w:p>
     <w:p>
       <w:pPr>
@@ -3196,7 +4036,27 @@
           <w:lang w:eastAsia="sv-SE"/>
           <w14:ligatures w14:val="none"/>
         </w:rPr>
-        <w:t>• Skapa wireframes och färdig design för desktop-versionen.</w:t>
+        <w:t xml:space="preserve">• Skapa </w:t>
+      </w:r>
+      <w:proofErr w:type="spellStart"/>
+      <w:r>
+        <w:rPr>
+          <w:rFonts w:ascii="Times New Roman" w:eastAsia="Times New Roman" w:hAnsi="Times New Roman" w:cs="Times New Roman"/>
+          <w:kern w:val="0"/>
+          <w:lang w:eastAsia="sv-SE"/>
+          <w14:ligatures w14:val="none"/>
+        </w:rPr>
+        <w:t>wireframes</w:t>
+      </w:r>
+      <w:proofErr w:type="spellEnd"/>
+      <w:r>
+        <w:rPr>
+          <w:rFonts w:ascii="Times New Roman" w:eastAsia="Times New Roman" w:hAnsi="Times New Roman" w:cs="Times New Roman"/>
+          <w:kern w:val="0"/>
+          <w:lang w:eastAsia="sv-SE"/>
+          <w14:ligatures w14:val="none"/>
+        </w:rPr>
+        <w:t xml:space="preserve"> och färdig design för desktop-versionen.</w:t>
       </w:r>
     </w:p>
     <w:p>
@@ -3236,8 +4096,20 @@
           <w:lang w:eastAsia="sv-SE"/>
           <w14:ligatures w14:val="none"/>
         </w:rPr>
-        <w:t>Fas 3 – Utveckling av frontend</w:t>
-      </w:r>
+        <w:lastRenderedPageBreak/>
+        <w:t xml:space="preserve">Fas 3 – Utveckling av </w:t>
+      </w:r>
+      <w:proofErr w:type="spellStart"/>
+      <w:r>
+        <w:rPr>
+          <w:rFonts w:ascii="Times New Roman" w:eastAsia="Times New Roman" w:hAnsi="Times New Roman" w:cs="Times New Roman"/>
+          <w:kern w:val="0"/>
+          <w:lang w:eastAsia="sv-SE"/>
+          <w14:ligatures w14:val="none"/>
+        </w:rPr>
+        <w:t>frontend</w:t>
+      </w:r>
+      <w:proofErr w:type="spellEnd"/>
     </w:p>
     <w:p>
       <w:pPr>
@@ -3256,7 +4128,27 @@
           <w:lang w:eastAsia="sv-SE"/>
           <w14:ligatures w14:val="none"/>
         </w:rPr>
-        <w:t>• Skapa projektstruktur i React.</w:t>
+        <w:t xml:space="preserve">• Skapa projektstruktur i </w:t>
+      </w:r>
+      <w:proofErr w:type="spellStart"/>
+      <w:r>
+        <w:rPr>
+          <w:rFonts w:ascii="Times New Roman" w:eastAsia="Times New Roman" w:hAnsi="Times New Roman" w:cs="Times New Roman"/>
+          <w:kern w:val="0"/>
+          <w:lang w:eastAsia="sv-SE"/>
+          <w14:ligatures w14:val="none"/>
+        </w:rPr>
+        <w:t>React</w:t>
+      </w:r>
+      <w:proofErr w:type="spellEnd"/>
+      <w:r>
+        <w:rPr>
+          <w:rFonts w:ascii="Times New Roman" w:eastAsia="Times New Roman" w:hAnsi="Times New Roman" w:cs="Times New Roman"/>
+          <w:kern w:val="0"/>
+          <w:lang w:eastAsia="sv-SE"/>
+          <w14:ligatures w14:val="none"/>
+        </w:rPr>
+        <w:t>.</w:t>
       </w:r>
     </w:p>
     <w:p>
@@ -3276,7 +4168,27 @@
           <w:lang w:eastAsia="sv-SE"/>
           <w14:ligatures w14:val="none"/>
         </w:rPr>
-        <w:t>• Implementera navigering (React Router).</w:t>
+        <w:t>• Implementera navigering (</w:t>
+      </w:r>
+      <w:proofErr w:type="spellStart"/>
+      <w:r>
+        <w:rPr>
+          <w:rFonts w:ascii="Times New Roman" w:eastAsia="Times New Roman" w:hAnsi="Times New Roman" w:cs="Times New Roman"/>
+          <w:kern w:val="0"/>
+          <w:lang w:eastAsia="sv-SE"/>
+          <w14:ligatures w14:val="none"/>
+        </w:rPr>
+        <w:t>React</w:t>
+      </w:r>
+      <w:proofErr w:type="spellEnd"/>
+      <w:r>
+        <w:rPr>
+          <w:rFonts w:ascii="Times New Roman" w:eastAsia="Times New Roman" w:hAnsi="Times New Roman" w:cs="Times New Roman"/>
+          <w:kern w:val="0"/>
+          <w:lang w:eastAsia="sv-SE"/>
+          <w14:ligatures w14:val="none"/>
+        </w:rPr>
+        <w:t xml:space="preserve"> Router).</w:t>
       </w:r>
     </w:p>
     <w:p>
@@ -3336,7 +4248,47 @@
           <w:lang w:eastAsia="sv-SE"/>
           <w14:ligatures w14:val="none"/>
         </w:rPr>
-        <w:t>Fas 4 – Backend (json-server)</w:t>
+        <w:t xml:space="preserve">Fas 4 – </w:t>
+      </w:r>
+      <w:proofErr w:type="spellStart"/>
+      <w:r>
+        <w:rPr>
+          <w:rFonts w:ascii="Times New Roman" w:eastAsia="Times New Roman" w:hAnsi="Times New Roman" w:cs="Times New Roman"/>
+          <w:kern w:val="0"/>
+          <w:lang w:eastAsia="sv-SE"/>
+          <w14:ligatures w14:val="none"/>
+        </w:rPr>
+        <w:t>Backend</w:t>
+      </w:r>
+      <w:proofErr w:type="spellEnd"/>
+      <w:r>
+        <w:rPr>
+          <w:rFonts w:ascii="Times New Roman" w:eastAsia="Times New Roman" w:hAnsi="Times New Roman" w:cs="Times New Roman"/>
+          <w:kern w:val="0"/>
+          <w:lang w:eastAsia="sv-SE"/>
+          <w14:ligatures w14:val="none"/>
+        </w:rPr>
+        <w:t xml:space="preserve"> (</w:t>
+      </w:r>
+      <w:proofErr w:type="spellStart"/>
+      <w:r>
+        <w:rPr>
+          <w:rFonts w:ascii="Times New Roman" w:eastAsia="Times New Roman" w:hAnsi="Times New Roman" w:cs="Times New Roman"/>
+          <w:kern w:val="0"/>
+          <w:lang w:eastAsia="sv-SE"/>
+          <w14:ligatures w14:val="none"/>
+        </w:rPr>
+        <w:t>json</w:t>
+      </w:r>
+      <w:proofErr w:type="spellEnd"/>
+      <w:r>
+        <w:rPr>
+          <w:rFonts w:ascii="Times New Roman" w:eastAsia="Times New Roman" w:hAnsi="Times New Roman" w:cs="Times New Roman"/>
+          <w:kern w:val="0"/>
+          <w:lang w:eastAsia="sv-SE"/>
+          <w14:ligatures w14:val="none"/>
+        </w:rPr>
+        <w:t>-server)</w:t>
       </w:r>
     </w:p>
     <w:p>
@@ -3356,7 +4308,27 @@
           <w:lang w:eastAsia="sv-SE"/>
           <w14:ligatures w14:val="none"/>
         </w:rPr>
-        <w:t>• Sätta upp json-server med rätt databasstruktur (produkter,</w:t>
+        <w:t xml:space="preserve">• Sätta upp </w:t>
+      </w:r>
+      <w:proofErr w:type="spellStart"/>
+      <w:r>
+        <w:rPr>
+          <w:rFonts w:ascii="Times New Roman" w:eastAsia="Times New Roman" w:hAnsi="Times New Roman" w:cs="Times New Roman"/>
+          <w:kern w:val="0"/>
+          <w:lang w:eastAsia="sv-SE"/>
+          <w14:ligatures w14:val="none"/>
+        </w:rPr>
+        <w:t>json</w:t>
+      </w:r>
+      <w:proofErr w:type="spellEnd"/>
+      <w:r>
+        <w:rPr>
+          <w:rFonts w:ascii="Times New Roman" w:eastAsia="Times New Roman" w:hAnsi="Times New Roman" w:cs="Times New Roman"/>
+          <w:kern w:val="0"/>
+          <w:lang w:eastAsia="sv-SE"/>
+          <w14:ligatures w14:val="none"/>
+        </w:rPr>
+        <w:t>-server med rätt databasstruktur (produkter,</w:t>
       </w:r>
     </w:p>
     <w:p>
@@ -3396,8 +4368,39 @@
           <w:lang w:eastAsia="sv-SE"/>
           <w14:ligatures w14:val="none"/>
         </w:rPr>
-        <w:t>• json-server ska användas för att tillhandahålla endpoints</w:t>
-      </w:r>
+        <w:t xml:space="preserve">• </w:t>
+      </w:r>
+      <w:proofErr w:type="spellStart"/>
+      <w:r>
+        <w:rPr>
+          <w:rFonts w:ascii="Times New Roman" w:eastAsia="Times New Roman" w:hAnsi="Times New Roman" w:cs="Times New Roman"/>
+          <w:kern w:val="0"/>
+          <w:lang w:eastAsia="sv-SE"/>
+          <w14:ligatures w14:val="none"/>
+        </w:rPr>
+        <w:t>json</w:t>
+      </w:r>
+      <w:proofErr w:type="spellEnd"/>
+      <w:r>
+        <w:rPr>
+          <w:rFonts w:ascii="Times New Roman" w:eastAsia="Times New Roman" w:hAnsi="Times New Roman" w:cs="Times New Roman"/>
+          <w:kern w:val="0"/>
+          <w:lang w:eastAsia="sv-SE"/>
+          <w14:ligatures w14:val="none"/>
+        </w:rPr>
+        <w:t xml:space="preserve">-server ska användas för att tillhandahålla </w:t>
+      </w:r>
+      <w:proofErr w:type="spellStart"/>
+      <w:r>
+        <w:rPr>
+          <w:rFonts w:ascii="Times New Roman" w:eastAsia="Times New Roman" w:hAnsi="Times New Roman" w:cs="Times New Roman"/>
+          <w:kern w:val="0"/>
+          <w:lang w:eastAsia="sv-SE"/>
+          <w14:ligatures w14:val="none"/>
+        </w:rPr>
+        <w:t>endpoints</w:t>
+      </w:r>
+      <w:proofErr w:type="spellEnd"/>
     </w:p>
     <w:p>
       <w:pPr>
@@ -3416,7 +4419,27 @@
           <w:lang w:eastAsia="sv-SE"/>
           <w14:ligatures w14:val="none"/>
         </w:rPr>
-        <w:t>för att hämta och skicka data, exempelvis GET /products,</w:t>
+        <w:t>för att hämta och skicka data, exempelvis GET /</w:t>
+      </w:r>
+      <w:proofErr w:type="spellStart"/>
+      <w:r>
+        <w:rPr>
+          <w:rFonts w:ascii="Times New Roman" w:eastAsia="Times New Roman" w:hAnsi="Times New Roman" w:cs="Times New Roman"/>
+          <w:kern w:val="0"/>
+          <w:lang w:eastAsia="sv-SE"/>
+          <w14:ligatures w14:val="none"/>
+        </w:rPr>
+        <w:t>products</w:t>
+      </w:r>
+      <w:proofErr w:type="spellEnd"/>
+      <w:r>
+        <w:rPr>
+          <w:rFonts w:ascii="Times New Roman" w:eastAsia="Times New Roman" w:hAnsi="Times New Roman" w:cs="Times New Roman"/>
+          <w:kern w:val="0"/>
+          <w:lang w:eastAsia="sv-SE"/>
+          <w14:ligatures w14:val="none"/>
+        </w:rPr>
+        <w:t>,</w:t>
       </w:r>
     </w:p>
     <w:p>
@@ -3436,7 +4459,27 @@
           <w:lang w:eastAsia="sv-SE"/>
           <w14:ligatures w14:val="none"/>
         </w:rPr>
-        <w:t>POST /orders, och om ni gör inloggning: GET /users.</w:t>
+        <w:t>POST /orders, och om ni gör inloggning: GET /</w:t>
+      </w:r>
+      <w:proofErr w:type="spellStart"/>
+      <w:r>
+        <w:rPr>
+          <w:rFonts w:ascii="Times New Roman" w:eastAsia="Times New Roman" w:hAnsi="Times New Roman" w:cs="Times New Roman"/>
+          <w:kern w:val="0"/>
+          <w:lang w:eastAsia="sv-SE"/>
+          <w14:ligatures w14:val="none"/>
+        </w:rPr>
+        <w:t>users</w:t>
+      </w:r>
+      <w:proofErr w:type="spellEnd"/>
+      <w:r>
+        <w:rPr>
+          <w:rFonts w:ascii="Times New Roman" w:eastAsia="Times New Roman" w:hAnsi="Times New Roman" w:cs="Times New Roman"/>
+          <w:kern w:val="0"/>
+          <w:lang w:eastAsia="sv-SE"/>
+          <w14:ligatures w14:val="none"/>
+        </w:rPr>
+        <w:t>.</w:t>
       </w:r>
     </w:p>
     <w:p>
@@ -3456,7 +4499,27 @@
           <w:lang w:eastAsia="sv-SE"/>
           <w14:ligatures w14:val="none"/>
         </w:rPr>
-        <w:t>• (VG: Sätt upp en Node.js Backend med Express.js)</w:t>
+        <w:t xml:space="preserve">• (VG: Sätt upp en Node.js </w:t>
+      </w:r>
+      <w:proofErr w:type="spellStart"/>
+      <w:r>
+        <w:rPr>
+          <w:rFonts w:ascii="Times New Roman" w:eastAsia="Times New Roman" w:hAnsi="Times New Roman" w:cs="Times New Roman"/>
+          <w:kern w:val="0"/>
+          <w:lang w:eastAsia="sv-SE"/>
+          <w14:ligatures w14:val="none"/>
+        </w:rPr>
+        <w:t>Backend</w:t>
+      </w:r>
+      <w:proofErr w:type="spellEnd"/>
+      <w:r>
+        <w:rPr>
+          <w:rFonts w:ascii="Times New Roman" w:eastAsia="Times New Roman" w:hAnsi="Times New Roman" w:cs="Times New Roman"/>
+          <w:kern w:val="0"/>
+          <w:lang w:eastAsia="sv-SE"/>
+          <w14:ligatures w14:val="none"/>
+        </w:rPr>
+        <w:t xml:space="preserve"> med Express.js)</w:t>
       </w:r>
     </w:p>
     <w:p>
@@ -3476,7 +4539,27 @@
           <w:lang w:eastAsia="sv-SE"/>
           <w14:ligatures w14:val="none"/>
         </w:rPr>
-        <w:t>• Testa API-anrop från frontend.</w:t>
+        <w:t xml:space="preserve">• Testa API-anrop från </w:t>
+      </w:r>
+      <w:proofErr w:type="spellStart"/>
+      <w:r>
+        <w:rPr>
+          <w:rFonts w:ascii="Times New Roman" w:eastAsia="Times New Roman" w:hAnsi="Times New Roman" w:cs="Times New Roman"/>
+          <w:kern w:val="0"/>
+          <w:lang w:eastAsia="sv-SE"/>
+          <w14:ligatures w14:val="none"/>
+        </w:rPr>
+        <w:t>frontend</w:t>
+      </w:r>
+      <w:proofErr w:type="spellEnd"/>
+      <w:r>
+        <w:rPr>
+          <w:rFonts w:ascii="Times New Roman" w:eastAsia="Times New Roman" w:hAnsi="Times New Roman" w:cs="Times New Roman"/>
+          <w:kern w:val="0"/>
+          <w:lang w:eastAsia="sv-SE"/>
+          <w14:ligatures w14:val="none"/>
+        </w:rPr>
+        <w:t>.</w:t>
       </w:r>
     </w:p>
     <w:p>
@@ -3576,8 +4659,27 @@
           <w:lang w:eastAsia="sv-SE"/>
           <w14:ligatures w14:val="none"/>
         </w:rPr>
-        <w:lastRenderedPageBreak/>
-        <w:t>• Testa appens funktioner noggrant på både desktop och</w:t>
+        <w:t xml:space="preserve">• Testa </w:t>
+      </w:r>
+      <w:proofErr w:type="spellStart"/>
+      <w:r>
+        <w:rPr>
+          <w:rFonts w:ascii="Times New Roman" w:eastAsia="Times New Roman" w:hAnsi="Times New Roman" w:cs="Times New Roman"/>
+          <w:kern w:val="0"/>
+          <w:lang w:eastAsia="sv-SE"/>
+          <w14:ligatures w14:val="none"/>
+        </w:rPr>
+        <w:t>appens</w:t>
+      </w:r>
+      <w:proofErr w:type="spellEnd"/>
+      <w:r>
+        <w:rPr>
+          <w:rFonts w:ascii="Times New Roman" w:eastAsia="Times New Roman" w:hAnsi="Times New Roman" w:cs="Times New Roman"/>
+          <w:kern w:val="0"/>
+          <w:lang w:eastAsia="sv-SE"/>
+          <w14:ligatures w14:val="none"/>
+        </w:rPr>
+        <w:t xml:space="preserve"> funktioner noggrant på både desktop och</w:t>
       </w:r>
     </w:p>
     <w:p>
@@ -3717,8 +4819,19 @@
           <w:lang w:eastAsia="sv-SE"/>
           <w14:ligatures w14:val="none"/>
         </w:rPr>
-        <w:t>o (VG) Beskrivning av Backend</w:t>
-      </w:r>
+        <w:t xml:space="preserve">o (VG) Beskrivning av </w:t>
+      </w:r>
+      <w:proofErr w:type="spellStart"/>
+      <w:r>
+        <w:rPr>
+          <w:rFonts w:ascii="Times New Roman" w:eastAsia="Times New Roman" w:hAnsi="Times New Roman" w:cs="Times New Roman"/>
+          <w:kern w:val="0"/>
+          <w:lang w:eastAsia="sv-SE"/>
+          <w14:ligatures w14:val="none"/>
+        </w:rPr>
+        <w:t>Backend</w:t>
+      </w:r>
+      <w:proofErr w:type="spellEnd"/>
     </w:p>
     <w:p>
       <w:pPr>
@@ -3737,6 +4850,7 @@
           <w:lang w:eastAsia="sv-SE"/>
           <w14:ligatures w14:val="none"/>
         </w:rPr>
+        <w:lastRenderedPageBreak/>
         <w:t>o projektanalys och reflektion.</w:t>
       </w:r>
     </w:p>
@@ -3757,7 +4871,27 @@
           <w:lang w:eastAsia="sv-SE"/>
           <w14:ligatures w14:val="none"/>
         </w:rPr>
-        <w:t>• Lägga in slutlig kod på GitHub.</w:t>
+        <w:t xml:space="preserve">• Lägga in slutlig kod på </w:t>
+      </w:r>
+      <w:proofErr w:type="spellStart"/>
+      <w:r>
+        <w:rPr>
+          <w:rFonts w:ascii="Times New Roman" w:eastAsia="Times New Roman" w:hAnsi="Times New Roman" w:cs="Times New Roman"/>
+          <w:kern w:val="0"/>
+          <w:lang w:eastAsia="sv-SE"/>
+          <w14:ligatures w14:val="none"/>
+        </w:rPr>
+        <w:t>GitHub</w:t>
+      </w:r>
+      <w:proofErr w:type="spellEnd"/>
+      <w:r>
+        <w:rPr>
+          <w:rFonts w:ascii="Times New Roman" w:eastAsia="Times New Roman" w:hAnsi="Times New Roman" w:cs="Times New Roman"/>
+          <w:kern w:val="0"/>
+          <w:lang w:eastAsia="sv-SE"/>
+          <w14:ligatures w14:val="none"/>
+        </w:rPr>
+        <w:t>.</w:t>
       </w:r>
     </w:p>
     <w:p/>
@@ -17511,7 +18645,6 @@
   <w:style w:type="character" w:default="1" w:styleId="Standardstycketeckensnitt">
     <w:name w:val="Default Paragraph Font"/>
     <w:uiPriority w:val="1"/>
-    <w:semiHidden/>
     <w:unhideWhenUsed/>
   </w:style>
   <w:style w:type="table" w:default="1" w:styleId="Normaltabell">

</xml_diff>